<commit_message>
Lab 9: cut Step 9 to two runs for the no-class Week 10
The instructor is away Week 10, so Lab 9 is now doable from its page alone.
Step 9 drops from four dialog runs (250 and 4,000 points, a digitized outline,
a Spline copy of the model) to two: 250 points, and the reference outline
buffered 200 m (Butte_Boundary_Wide). The cells-below-the-plain column and
its Con recipe, the spline question and the digitizing go with them; the
write-up is 2 pages; the tile XML metadata files are optional; Map 2 is the
wide-outline run. Report template, rubric, the Week 10 deck's Lab 9 slide and
the Midterm 2 guide follow. Week 10 page and the lab carry a while-away note
with the help channel.

Oracle for the two runs (seed 1, ring rebuilt from the outline as the
student's model does) is in the private repo; tools/lab09/wide_outline_oracle.py
computes it.

Co-Authored-By: Claude Fable 5.1 <noreply@anthropic.com>
</commit_message>
<xml_diff>
--- a/docs/assignments/lab-09/lab09-report-template.docx
+++ b/docs/assignments/lab-09/lab09-report-template.docx
@@ -2660,7 +2660,7 @@
           <w:sz w:val="19"/>
           <w:szCs w:val="19"/>
         </w:rPr>
-        <w:t xml:space="preserve">Rubric: one table with the baseline and the four Step 9 runs, with the points kept, the outline area, the volume, the tallest cell and the cells below the plain (4 points). Step 9 says where to read each value.</w:t>
+        <w:t>Rubric: one table with the baseline and the two Step 9 runs (250 points; the wide outline), with the points kept, the outline area, the volume and the tallest cell, and the numbers match a run with your seed (5 points). Step 9 says where to read each value.</w:t>
       </w:r>
     </w:p>
     <w:p>
@@ -2696,7 +2696,6 @@
         <w:gridCol w:w="1350"/>
         <w:gridCol w:w="1250"/>
         <w:gridCol w:w="1300"/>
-        <w:gridCol w:w="1510"/>
       </w:tblGrid>
       <w:tr>
         <w:trPr>
@@ -2847,30 +2846,6 @@
             </w:r>
           </w:p>
         </w:tc>
-        <w:tc>
-          <w:tcPr>
-            <w:tcW w:type="dxa" w:w="1510"/>
-            <w:shd w:fill="D9E2F3" w:color="auto" w:val="clear"/>
-            <w:tcMar>
-              <w:top w:type="dxa" w:w="90"/>
-              <w:left w:type="dxa" w:w="120"/>
-              <w:bottom w:type="dxa" w:w="90"/>
-              <w:right w:type="dxa" w:w="120"/>
-            </w:tcMar>
-          </w:tcPr>
-          <w:p>
-            <w:r>
-              <w:rPr>
-                <w:b/>
-                <w:bCs/>
-                <w:color w:val="1F3864"/>
-                <w:sz w:val="19"/>
-                <w:szCs w:val="19"/>
-              </w:rPr>
-              <w:t xml:space="preserve">Cells below the plain</w:t>
-            </w:r>
-          </w:p>
-        </w:tc>
       </w:tr>
       <w:tr>
         <w:trPr>
@@ -3002,27 +2977,6 @@
             </w:r>
           </w:p>
         </w:tc>
-        <w:tc>
-          <w:tcPr>
-            <w:tcW w:type="dxa" w:w="1510"/>
-            <w:tcMar>
-              <w:top w:type="dxa" w:w="90"/>
-              <w:left w:type="dxa" w:w="120"/>
-              <w:bottom w:type="dxa" w:w="90"/>
-              <w:right w:type="dxa" w:w="120"/>
-            </w:tcMar>
-          </w:tcPr>
-          <w:p>
-            <w:r>
-              <w:rPr>
-                <w:color w:val="767171"/>
-                <w:sz w:val="19"/>
-                <w:szCs w:val="19"/>
-              </w:rPr>
-              <w:t xml:space="preserve"> </w:t>
-            </w:r>
-          </w:p>
-        </w:tc>
       </w:tr>
       <w:tr>
         <w:trPr>
@@ -3160,28 +3114,6 @@
             </w:r>
           </w:p>
         </w:tc>
-        <w:tc>
-          <w:tcPr>
-            <w:tcW w:type="dxa" w:w="1510"/>
-            <w:shd w:fill="F2F2F2" w:color="auto" w:val="clear"/>
-            <w:tcMar>
-              <w:top w:type="dxa" w:w="90"/>
-              <w:left w:type="dxa" w:w="120"/>
-              <w:bottom w:type="dxa" w:w="90"/>
-              <w:right w:type="dxa" w:w="120"/>
-            </w:tcMar>
-          </w:tcPr>
-          <w:p>
-            <w:r>
-              <w:rPr>
-                <w:color w:val="767171"/>
-                <w:sz w:val="19"/>
-                <w:szCs w:val="19"/>
-              </w:rPr>
-              <w:t xml:space="preserve"> </w:t>
-            </w:r>
-          </w:p>
-        </w:tc>
       </w:tr>
       <w:tr>
         <w:trPr>
@@ -3190,6 +3122,7 @@
         <w:tc>
           <w:tcPr>
             <w:tcW w:type="dxa" w:w="1250"/>
+            <w:shd w:fill="F2F2F2" w:color="auto" w:val="clear"/>
             <w:tcMar>
               <w:top w:type="dxa" w:w="90"/>
               <w:left w:type="dxa" w:w="120"/>
@@ -3204,13 +3137,14 @@
                 <w:sz w:val="19"/>
                 <w:szCs w:val="19"/>
               </w:rPr>
-              <w:t xml:space="preserve">4,000 points</w:t>
+              <w:t>Wide outline (+200 m)</w:t>
             </w:r>
           </w:p>
         </w:tc>
         <w:tc>
           <w:tcPr>
             <w:tcW w:type="dxa" w:w="1600"/>
+            <w:shd w:fill="F2F2F2" w:color="auto" w:val="clear"/>
             <w:tcMar>
               <w:top w:type="dxa" w:w="90"/>
               <w:left w:type="dxa" w:w="120"/>
@@ -3232,6 +3166,7 @@
         <w:tc>
           <w:tcPr>
             <w:tcW w:type="dxa" w:w="1100"/>
+            <w:shd w:fill="F2F2F2" w:color="auto" w:val="clear"/>
             <w:tcMar>
               <w:top w:type="dxa" w:w="90"/>
               <w:left w:type="dxa" w:w="120"/>
@@ -3253,92 +3188,25 @@
         <w:tc>
           <w:tcPr>
             <w:tcW w:type="dxa" w:w="1350"/>
-            <w:tcMar>
-              <w:top w:type="dxa" w:w="90"/>
-              <w:left w:type="dxa" w:w="120"/>
-              <w:bottom w:type="dxa" w:w="90"/>
-              <w:right w:type="dxa" w:w="120"/>
-            </w:tcMar>
-          </w:tcPr>
-          <w:p>
-            <w:r>
-              <w:rPr>
-                <w:color w:val="767171"/>
-                <w:sz w:val="19"/>
-                <w:szCs w:val="19"/>
-              </w:rPr>
-              <w:t xml:space="preserve"> </w:t>
-            </w:r>
-          </w:p>
-        </w:tc>
-        <w:tc>
-          <w:tcPr>
-            <w:tcW w:type="dxa" w:w="1250"/>
-            <w:tcMar>
-              <w:top w:type="dxa" w:w="90"/>
-              <w:left w:type="dxa" w:w="120"/>
-              <w:bottom w:type="dxa" w:w="90"/>
-              <w:right w:type="dxa" w:w="120"/>
-            </w:tcMar>
-          </w:tcPr>
-          <w:p>
-            <w:r>
-              <w:rPr>
-                <w:color w:val="767171"/>
-                <w:sz w:val="19"/>
-                <w:szCs w:val="19"/>
-              </w:rPr>
-              <w:t xml:space="preserve"> </w:t>
-            </w:r>
-          </w:p>
-        </w:tc>
-        <w:tc>
-          <w:tcPr>
-            <w:tcW w:type="dxa" w:w="1300"/>
-            <w:tcMar>
-              <w:top w:type="dxa" w:w="90"/>
-              <w:left w:type="dxa" w:w="120"/>
-              <w:bottom w:type="dxa" w:w="90"/>
-              <w:right w:type="dxa" w:w="120"/>
-            </w:tcMar>
-          </w:tcPr>
-          <w:p>
-            <w:r>
-              <w:rPr>
-                <w:color w:val="767171"/>
-                <w:sz w:val="19"/>
-                <w:szCs w:val="19"/>
-              </w:rPr>
-              <w:t xml:space="preserve"> </w:t>
-            </w:r>
-          </w:p>
-        </w:tc>
-        <w:tc>
-          <w:tcPr>
-            <w:tcW w:type="dxa" w:w="1510"/>
-            <w:tcMar>
-              <w:top w:type="dxa" w:w="90"/>
-              <w:left w:type="dxa" w:w="120"/>
-              <w:bottom w:type="dxa" w:w="90"/>
-              <w:right w:type="dxa" w:w="120"/>
-            </w:tcMar>
-          </w:tcPr>
-          <w:p>
-            <w:r>
-              <w:rPr>
-                <w:color w:val="767171"/>
-                <w:sz w:val="19"/>
-                <w:szCs w:val="19"/>
-              </w:rPr>
-              <w:t xml:space="preserve"> </w:t>
-            </w:r>
-          </w:p>
-        </w:tc>
-      </w:tr>
-      <w:tr>
-        <w:trPr>
-          <w:cantSplit/>
-        </w:trPr>
+            <w:shd w:fill="F2F2F2" w:color="auto" w:val="clear"/>
+            <w:tcMar>
+              <w:top w:type="dxa" w:w="90"/>
+              <w:left w:type="dxa" w:w="120"/>
+              <w:bottom w:type="dxa" w:w="90"/>
+              <w:right w:type="dxa" w:w="120"/>
+            </w:tcMar>
+          </w:tcPr>
+          <w:p>
+            <w:r>
+              <w:rPr>
+                <w:color w:val="767171"/>
+                <w:sz w:val="19"/>
+                <w:szCs w:val="19"/>
+              </w:rPr>
+              <w:t xml:space="preserve"> </w:t>
+            </w:r>
+          </w:p>
+        </w:tc>
         <w:tc>
           <w:tcPr>
             <w:tcW w:type="dxa" w:w="1250"/>
@@ -3353,94 +3221,6 @@
           <w:p>
             <w:r>
               <w:rPr>
-                <w:color w:val="000000"/>
-                <w:sz w:val="19"/>
-                <w:szCs w:val="19"/>
-              </w:rPr>
-              <w:t xml:space="preserve">Your own outline</w:t>
-            </w:r>
-          </w:p>
-        </w:tc>
-        <w:tc>
-          <w:tcPr>
-            <w:tcW w:type="dxa" w:w="1600"/>
-            <w:shd w:fill="F2F2F2" w:color="auto" w:val="clear"/>
-            <w:tcMar>
-              <w:top w:type="dxa" w:w="90"/>
-              <w:left w:type="dxa" w:w="120"/>
-              <w:bottom w:type="dxa" w:w="90"/>
-              <w:right w:type="dxa" w:w="120"/>
-            </w:tcMar>
-          </w:tcPr>
-          <w:p>
-            <w:r>
-              <w:rPr>
-                <w:color w:val="767171"/>
-                <w:sz w:val="19"/>
-                <w:szCs w:val="19"/>
-              </w:rPr>
-              <w:t xml:space="preserve"> </w:t>
-            </w:r>
-          </w:p>
-        </w:tc>
-        <w:tc>
-          <w:tcPr>
-            <w:tcW w:type="dxa" w:w="1100"/>
-            <w:shd w:fill="F2F2F2" w:color="auto" w:val="clear"/>
-            <w:tcMar>
-              <w:top w:type="dxa" w:w="90"/>
-              <w:left w:type="dxa" w:w="120"/>
-              <w:bottom w:type="dxa" w:w="90"/>
-              <w:right w:type="dxa" w:w="120"/>
-            </w:tcMar>
-          </w:tcPr>
-          <w:p>
-            <w:r>
-              <w:rPr>
-                <w:color w:val="767171"/>
-                <w:sz w:val="19"/>
-                <w:szCs w:val="19"/>
-              </w:rPr>
-              <w:t xml:space="preserve"> </w:t>
-            </w:r>
-          </w:p>
-        </w:tc>
-        <w:tc>
-          <w:tcPr>
-            <w:tcW w:type="dxa" w:w="1350"/>
-            <w:shd w:fill="F2F2F2" w:color="auto" w:val="clear"/>
-            <w:tcMar>
-              <w:top w:type="dxa" w:w="90"/>
-              <w:left w:type="dxa" w:w="120"/>
-              <w:bottom w:type="dxa" w:w="90"/>
-              <w:right w:type="dxa" w:w="120"/>
-            </w:tcMar>
-          </w:tcPr>
-          <w:p>
-            <w:r>
-              <w:rPr>
-                <w:color w:val="767171"/>
-                <w:sz w:val="19"/>
-                <w:szCs w:val="19"/>
-              </w:rPr>
-              <w:t xml:space="preserve"> </w:t>
-            </w:r>
-          </w:p>
-        </w:tc>
-        <w:tc>
-          <w:tcPr>
-            <w:tcW w:type="dxa" w:w="1250"/>
-            <w:shd w:fill="F2F2F2" w:color="auto" w:val="clear"/>
-            <w:tcMar>
-              <w:top w:type="dxa" w:w="90"/>
-              <w:left w:type="dxa" w:w="120"/>
-              <w:bottom w:type="dxa" w:w="90"/>
-              <w:right w:type="dxa" w:w="120"/>
-            </w:tcMar>
-          </w:tcPr>
-          <w:p>
-            <w:r>
-              <w:rPr>
                 <w:color w:val="767171"/>
                 <w:sz w:val="19"/>
                 <w:szCs w:val="19"/>
@@ -3453,180 +3233,6 @@
           <w:tcPr>
             <w:tcW w:type="dxa" w:w="1300"/>
             <w:shd w:fill="F2F2F2" w:color="auto" w:val="clear"/>
-            <w:tcMar>
-              <w:top w:type="dxa" w:w="90"/>
-              <w:left w:type="dxa" w:w="120"/>
-              <w:bottom w:type="dxa" w:w="90"/>
-              <w:right w:type="dxa" w:w="120"/>
-            </w:tcMar>
-          </w:tcPr>
-          <w:p>
-            <w:r>
-              <w:rPr>
-                <w:color w:val="767171"/>
-                <w:sz w:val="19"/>
-                <w:szCs w:val="19"/>
-              </w:rPr>
-              <w:t xml:space="preserve"> </w:t>
-            </w:r>
-          </w:p>
-        </w:tc>
-        <w:tc>
-          <w:tcPr>
-            <w:tcW w:type="dxa" w:w="1510"/>
-            <w:shd w:fill="F2F2F2" w:color="auto" w:val="clear"/>
-            <w:tcMar>
-              <w:top w:type="dxa" w:w="90"/>
-              <w:left w:type="dxa" w:w="120"/>
-              <w:bottom w:type="dxa" w:w="90"/>
-              <w:right w:type="dxa" w:w="120"/>
-            </w:tcMar>
-          </w:tcPr>
-          <w:p>
-            <w:r>
-              <w:rPr>
-                <w:color w:val="767171"/>
-                <w:sz w:val="19"/>
-                <w:szCs w:val="19"/>
-              </w:rPr>
-              <w:t xml:space="preserve"> </w:t>
-            </w:r>
-          </w:p>
-        </w:tc>
-      </w:tr>
-      <w:tr>
-        <w:trPr>
-          <w:cantSplit/>
-        </w:trPr>
-        <w:tc>
-          <w:tcPr>
-            <w:tcW w:type="dxa" w:w="1250"/>
-            <w:tcMar>
-              <w:top w:type="dxa" w:w="90"/>
-              <w:left w:type="dxa" w:w="120"/>
-              <w:bottom w:type="dxa" w:w="90"/>
-              <w:right w:type="dxa" w:w="120"/>
-            </w:tcMar>
-          </w:tcPr>
-          <w:p>
-            <w:r>
-              <w:rPr>
-                <w:color w:val="000000"/>
-                <w:sz w:val="19"/>
-                <w:szCs w:val="19"/>
-              </w:rPr>
-              <w:t xml:space="preserve">Spline</w:t>
-            </w:r>
-          </w:p>
-        </w:tc>
-        <w:tc>
-          <w:tcPr>
-            <w:tcW w:type="dxa" w:w="1600"/>
-            <w:tcMar>
-              <w:top w:type="dxa" w:w="90"/>
-              <w:left w:type="dxa" w:w="120"/>
-              <w:bottom w:type="dxa" w:w="90"/>
-              <w:right w:type="dxa" w:w="120"/>
-            </w:tcMar>
-          </w:tcPr>
-          <w:p>
-            <w:r>
-              <w:rPr>
-                <w:color w:val="767171"/>
-                <w:sz w:val="19"/>
-                <w:szCs w:val="19"/>
-              </w:rPr>
-              <w:t xml:space="preserve"> </w:t>
-            </w:r>
-          </w:p>
-        </w:tc>
-        <w:tc>
-          <w:tcPr>
-            <w:tcW w:type="dxa" w:w="1100"/>
-            <w:tcMar>
-              <w:top w:type="dxa" w:w="90"/>
-              <w:left w:type="dxa" w:w="120"/>
-              <w:bottom w:type="dxa" w:w="90"/>
-              <w:right w:type="dxa" w:w="120"/>
-            </w:tcMar>
-          </w:tcPr>
-          <w:p>
-            <w:r>
-              <w:rPr>
-                <w:color w:val="767171"/>
-                <w:sz w:val="19"/>
-                <w:szCs w:val="19"/>
-              </w:rPr>
-              <w:t xml:space="preserve"> </w:t>
-            </w:r>
-          </w:p>
-        </w:tc>
-        <w:tc>
-          <w:tcPr>
-            <w:tcW w:type="dxa" w:w="1350"/>
-            <w:tcMar>
-              <w:top w:type="dxa" w:w="90"/>
-              <w:left w:type="dxa" w:w="120"/>
-              <w:bottom w:type="dxa" w:w="90"/>
-              <w:right w:type="dxa" w:w="120"/>
-            </w:tcMar>
-          </w:tcPr>
-          <w:p>
-            <w:r>
-              <w:rPr>
-                <w:color w:val="767171"/>
-                <w:sz w:val="19"/>
-                <w:szCs w:val="19"/>
-              </w:rPr>
-              <w:t xml:space="preserve"> </w:t>
-            </w:r>
-          </w:p>
-        </w:tc>
-        <w:tc>
-          <w:tcPr>
-            <w:tcW w:type="dxa" w:w="1250"/>
-            <w:tcMar>
-              <w:top w:type="dxa" w:w="90"/>
-              <w:left w:type="dxa" w:w="120"/>
-              <w:bottom w:type="dxa" w:w="90"/>
-              <w:right w:type="dxa" w:w="120"/>
-            </w:tcMar>
-          </w:tcPr>
-          <w:p>
-            <w:r>
-              <w:rPr>
-                <w:color w:val="767171"/>
-                <w:sz w:val="19"/>
-                <w:szCs w:val="19"/>
-              </w:rPr>
-              <w:t xml:space="preserve"> </w:t>
-            </w:r>
-          </w:p>
-        </w:tc>
-        <w:tc>
-          <w:tcPr>
-            <w:tcW w:type="dxa" w:w="1300"/>
-            <w:tcMar>
-              <w:top w:type="dxa" w:w="90"/>
-              <w:left w:type="dxa" w:w="120"/>
-              <w:bottom w:type="dxa" w:w="90"/>
-              <w:right w:type="dxa" w:w="120"/>
-            </w:tcMar>
-          </w:tcPr>
-          <w:p>
-            <w:r>
-              <w:rPr>
-                <w:color w:val="767171"/>
-                <w:sz w:val="19"/>
-                <w:szCs w:val="19"/>
-              </w:rPr>
-              <w:t xml:space="preserve"> </w:t>
-            </w:r>
-          </w:p>
-        </w:tc>
-        <w:tc>
-          <w:tcPr>
-            <w:tcW w:type="dxa" w:w="1510"/>
             <w:tcMar>
               <w:top w:type="dxa" w:w="90"/>
               <w:left w:type="dxa" w:w="120"/>
@@ -3660,7 +3266,7 @@
           <w:sz w:val="19"/>
           <w:szCs w:val="19"/>
         </w:rPr>
-        <w:t xml:space="preserve">Table 4. Sensitivity — the baseline and the four Step 9 runs.</w:t>
+        <w:t>Table 4. The baseline and the two Step 9 runs.</w:t>
       </w:r>
     </w:p>
     <w:p>
@@ -3676,7 +3282,7 @@
           <w:sz w:val="22"/>
           <w:szCs w:val="22"/>
         </w:rPr>
-        <w:t xml:space="preserve">Which choice moves the volume most, and which least? Rank them with your numbers. (3 points)</w:t>
+        <w:t>Which choice moved the volume more, the points or the outline? Give each run's difference from the baseline in cubic kilometers and as a percentage. (3 points)</w:t>
       </w:r>
     </w:p>
     <w:p>
@@ -3706,7 +3312,7 @@
           <w:sz w:val="22"/>
           <w:szCs w:val="22"/>
         </w:rPr>
-        <w:t>What did the spline do that IDW cannot? Map its cells below the plain and explain them with what you learned about the methods in Week 9 and Lab 8. (3 points)</w:t>
+        <w:t>What did the wider outline change: the area it counts, the plain it rebuilt, or both? Argue from your table's columns. (2 points)</w:t>
       </w:r>
     </w:p>
     <w:p>
@@ -3751,7 +3357,7 @@
           <w:sz w:val="19"/>
           <w:szCs w:val="19"/>
         </w:rPr>
-        <w:t xml:space="preserve">Rubric: what the volume measures and what the model cannot see (2 points). Step 9, question 3: is it the volume of the lava dome? Say what part of the dome the model cannot see, and what data would let you measure it.</w:t>
+        <w:t>Rubric: what the volume measures and what the model cannot see (2 points). Step 9, question 2: is it the volume of the lava dome? Say what part of the dome the model cannot see, and what data would let you measure it.</w:t>
       </w:r>
     </w:p>
     <w:p>
@@ -3958,7 +3564,7 @@
           <w:sz w:val="19"/>
           <w:szCs w:val="19"/>
         </w:rPr>
-        <w:t xml:space="preserve">Map 2. Scenario — your own outline or the spline, from Step 9.</w:t>
+        <w:t>Map 2. The wide-outline run from Step 9, same color scale as Map 1.</w:t>
       </w:r>
     </w:p>
     <w:p>
@@ -4212,7 +3818,7 @@
                 <w:sz w:val="19"/>
                 <w:szCs w:val="19"/>
               </w:rPr>
-              <w:t xml:space="preserve">Write-up (2–3 pages)</w:t>
+              <w:t>Write-up (2 pages)</w:t>
             </w:r>
           </w:p>
           <w:p>
@@ -4297,7 +3903,7 @@
                 <w:sz w:val="17"/>
                 <w:szCs w:val="17"/>
               </w:rPr>
-              <w:t xml:space="preserve">What the volume measures and what the model cannot see (Step 9, question 3) (2)</w:t>
+              <w:t>What the volume measures and what the model cannot see (Step 9, question 2) (2)</w:t>
             </w:r>
           </w:p>
           <w:p>
@@ -4744,7 +4350,7 @@
                 <w:sz w:val="19"/>
                 <w:szCs w:val="19"/>
               </w:rPr>
-              <w:t xml:space="preserve">Map 2 — one Step 9 scenario (full page, 8.5 × 11)</w:t>
+              <w:t>Map 2 — the wide outline (full page, 8.5 × 11)</w:t>
             </w:r>
           </w:p>
           <w:p>
@@ -4944,7 +4550,7 @@
                 <w:sz w:val="19"/>
                 <w:szCs w:val="19"/>
               </w:rPr>
-              <w:t xml:space="preserve">Sensitivity (Step 9)</w:t>
+              <w:t>Step 9 — two more runs</w:t>
             </w:r>
           </w:p>
           <w:p>
@@ -4961,7 +4567,7 @@
                 <w:sz w:val="17"/>
                 <w:szCs w:val="17"/>
               </w:rPr>
-              <w:t xml:space="preserve">One table with the baseline and the four Step 9 runs (250 and 4,000 points, your own outline, the spline), with the points kept, the outline area, the volume, the tallest cell and the cells below the plain (4)</w:t>
+              <w:t>One table with the baseline and the two Step 9 runs (250 points; the wide outline), with the points kept, the outline area, the volume and the tallest cell, and the numbers match a run with your seed (5)</w:t>
             </w:r>
           </w:p>
           <w:p>
@@ -4978,7 +4584,7 @@
                 <w:sz w:val="17"/>
                 <w:szCs w:val="17"/>
               </w:rPr>
-              <w:t xml:space="preserve">Which choice moves the volume most and least, ranked with your numbers (3)</w:t>
+              <w:t>Which choice moved the volume more, with each run's difference from the baseline in cubic kilometers and as a percentage (3)</w:t>
             </w:r>
           </w:p>
           <w:p>
@@ -4995,7 +4601,7 @@
                 <w:sz w:val="17"/>
                 <w:szCs w:val="17"/>
               </w:rPr>
-              <w:t xml:space="preserve">What the spline did that IDW cannot, mapped and explained (3)</w:t>
+              <w:t>What the wider outline changed, the area counted or the plain rebuilt or both, argued from your table (2)</w:t>
             </w:r>
           </w:p>
         </w:tc>

</xml_diff>

<commit_message>
Lab 9: Step 9 compares two bases, metadata deliverable dropped
Step 9 is now the wide outline (IDW) and a Spline copy of the model on the
reference outline, so Map 1 and Map 2 show the IDW and spline bases side by
side; the lowest-cell statistic replaces the Con count of cells below the
plain. The 250-point run and the three-value metadata deliverable are gone;
the write-up's two points move to "which base would you trust". Template,
rubric, deck slide and study guide follow. Oracle script renamed
step9_oracle.py; results in the private repo.

Co-Authored-By: Claude Fable 5.1 <noreply@anthropic.com>
</commit_message>
<xml_diff>
--- a/docs/assignments/lab-09/lab09-report-template.docx
+++ b/docs/assignments/lab-09/lab09-report-template.docx
@@ -391,371 +391,7 @@
           <w:sz w:val="28"/>
           <w:szCs w:val="28"/>
         </w:rPr>
-        <w:t xml:space="preserve">2.  The DEM and Its Metadata</w:t>
-      </w:r>
-    </w:p>
-    <w:p>
-      <w:pPr>
-        <w:spacing w:after="160" w:before="60"/>
-      </w:pPr>
-      <w:r>
-        <w:rPr>
-          <w:i/>
-          <w:iCs/>
-          <w:color w:val="767171"/>
-          <w:sz w:val="19"/>
-          <w:szCs w:val="19"/>
-        </w:rPr>
-        <w:t xml:space="preserve">Rubric: the three metadata values for the DEM and what each means for your result (2 points). Confirm them yourself from READ-ME-FIRST.txt, the raster’s properties and the two tiles’ metadata files — do not copy them from Figure A.</w:t>
-      </w:r>
-    </w:p>
-    <w:p>
-      <w:pPr>
-        <w:spacing w:after="260" w:before="0"/>
-      </w:pPr>
-      <w:r>
-        <w:rPr>
-          <w:i/>
-          <w:iCs/>
-          <w:color w:val="767171"/>
-          <w:highlight w:val="yellow"/>
-        </w:rPr>
-        <w:t xml:space="preserve">[Add your content here.]</w:t>
-      </w:r>
-    </w:p>
-    <w:tbl>
-      <w:tblPr>
-        <w:tblW w:type="dxa" w:w="9360"/>
-        <w:tblBorders>
-          <w:top w:val="single" w:color="auto" w:sz="4"/>
-          <w:left w:val="single" w:color="auto" w:sz="4"/>
-          <w:bottom w:val="single" w:color="auto" w:sz="4"/>
-          <w:right w:val="single" w:color="auto" w:sz="4"/>
-          <w:insideH w:val="single" w:color="auto" w:sz="4"/>
-          <w:insideV w:val="single" w:color="auto" w:sz="4"/>
-        </w:tblBorders>
-      </w:tblPr>
-      <w:tblGrid>
-        <w:gridCol w:w="2600"/>
-        <w:gridCol w:w="2400"/>
-        <w:gridCol w:w="4360"/>
-      </w:tblGrid>
-      <w:tr>
-        <w:trPr>
-          <w:cantSplit/>
-          <w:tblHeader/>
-        </w:trPr>
-        <w:tc>
-          <w:tcPr>
-            <w:tcW w:type="dxa" w:w="2600"/>
-            <w:shd w:fill="D9E2F3" w:color="auto" w:val="clear"/>
-            <w:tcMar>
-              <w:top w:type="dxa" w:w="90"/>
-              <w:left w:type="dxa" w:w="120"/>
-              <w:bottom w:type="dxa" w:w="90"/>
-              <w:right w:type="dxa" w:w="120"/>
-            </w:tcMar>
-          </w:tcPr>
-          <w:p>
-            <w:r>
-              <w:rPr>
-                <w:b/>
-                <w:bCs/>
-                <w:color w:val="1F3864"/>
-                <w:sz w:val="19"/>
-                <w:szCs w:val="19"/>
-              </w:rPr>
-              <w:t xml:space="preserve">Metadata value</w:t>
-            </w:r>
-          </w:p>
-        </w:tc>
-        <w:tc>
-          <w:tcPr>
-            <w:tcW w:type="dxa" w:w="2400"/>
-            <w:shd w:fill="D9E2F3" w:color="auto" w:val="clear"/>
-            <w:tcMar>
-              <w:top w:type="dxa" w:w="90"/>
-              <w:left w:type="dxa" w:w="120"/>
-              <w:bottom w:type="dxa" w:w="90"/>
-              <w:right w:type="dxa" w:w="120"/>
-            </w:tcMar>
-          </w:tcPr>
-          <w:p>
-            <w:r>
-              <w:rPr>
-                <w:b/>
-                <w:bCs/>
-                <w:color w:val="1F3864"/>
-                <w:sz w:val="19"/>
-                <w:szCs w:val="19"/>
-              </w:rPr>
-              <w:t xml:space="preserve">What you found</w:t>
-            </w:r>
-          </w:p>
-        </w:tc>
-        <w:tc>
-          <w:tcPr>
-            <w:tcW w:type="dxa" w:w="4360"/>
-            <w:shd w:fill="D9E2F3" w:color="auto" w:val="clear"/>
-            <w:tcMar>
-              <w:top w:type="dxa" w:w="90"/>
-              <w:left w:type="dxa" w:w="120"/>
-              <w:bottom w:type="dxa" w:w="90"/>
-              <w:right w:type="dxa" w:w="120"/>
-            </w:tcMar>
-          </w:tcPr>
-          <w:p>
-            <w:r>
-              <w:rPr>
-                <w:b/>
-                <w:bCs/>
-                <w:color w:val="1F3864"/>
-                <w:sz w:val="19"/>
-                <w:szCs w:val="19"/>
-              </w:rPr>
-              <w:t xml:space="preserve">What it means for your result</w:t>
-            </w:r>
-          </w:p>
-        </w:tc>
-      </w:tr>
-      <w:tr>
-        <w:trPr>
-          <w:cantSplit/>
-        </w:trPr>
-        <w:tc>
-          <w:tcPr>
-            <w:tcW w:type="dxa" w:w="2600"/>
-            <w:tcMar>
-              <w:top w:type="dxa" w:w="90"/>
-              <w:left w:type="dxa" w:w="120"/>
-              <w:bottom w:type="dxa" w:w="90"/>
-              <w:right w:type="dxa" w:w="120"/>
-            </w:tcMar>
-          </w:tcPr>
-          <w:p>
-            <w:r>
-              <w:rPr>
-                <w:color w:val="000000"/>
-                <w:sz w:val="19"/>
-                <w:szCs w:val="19"/>
-              </w:rPr>
-              <w:t xml:space="preserve">Publication date and source dates</w:t>
-            </w:r>
-          </w:p>
-        </w:tc>
-        <w:tc>
-          <w:tcPr>
-            <w:tcW w:type="dxa" w:w="2400"/>
-            <w:tcMar>
-              <w:top w:type="dxa" w:w="90"/>
-              <w:left w:type="dxa" w:w="120"/>
-              <w:bottom w:type="dxa" w:w="90"/>
-              <w:right w:type="dxa" w:w="120"/>
-            </w:tcMar>
-          </w:tcPr>
-          <w:p>
-            <w:r>
-              <w:rPr>
-                <w:color w:val="767171"/>
-                <w:sz w:val="19"/>
-                <w:szCs w:val="19"/>
-              </w:rPr>
-              <w:t xml:space="preserve"> </w:t>
-            </w:r>
-          </w:p>
-        </w:tc>
-        <w:tc>
-          <w:tcPr>
-            <w:tcW w:type="dxa" w:w="4360"/>
-            <w:tcMar>
-              <w:top w:type="dxa" w:w="90"/>
-              <w:left w:type="dxa" w:w="120"/>
-              <w:bottom w:type="dxa" w:w="90"/>
-              <w:right w:type="dxa" w:w="120"/>
-            </w:tcMar>
-          </w:tcPr>
-          <w:p>
-            <w:r>
-              <w:rPr>
-                <w:color w:val="767171"/>
-                <w:sz w:val="19"/>
-                <w:szCs w:val="19"/>
-              </w:rPr>
-              <w:t xml:space="preserve"> </w:t>
-            </w:r>
-          </w:p>
-        </w:tc>
-      </w:tr>
-      <w:tr>
-        <w:trPr>
-          <w:cantSplit/>
-        </w:trPr>
-        <w:tc>
-          <w:tcPr>
-            <w:tcW w:type="dxa" w:w="2600"/>
-            <w:shd w:fill="F2F2F2" w:color="auto" w:val="clear"/>
-            <w:tcMar>
-              <w:top w:type="dxa" w:w="90"/>
-              <w:left w:type="dxa" w:w="120"/>
-              <w:bottom w:type="dxa" w:w="90"/>
-              <w:right w:type="dxa" w:w="120"/>
-            </w:tcMar>
-          </w:tcPr>
-          <w:p>
-            <w:r>
-              <w:rPr>
-                <w:color w:val="000000"/>
-                <w:sz w:val="19"/>
-                <w:szCs w:val="19"/>
-              </w:rPr>
-              <w:t xml:space="preserve">Vertical datum and units</w:t>
-            </w:r>
-          </w:p>
-        </w:tc>
-        <w:tc>
-          <w:tcPr>
-            <w:tcW w:type="dxa" w:w="2400"/>
-            <w:shd w:fill="F2F2F2" w:color="auto" w:val="clear"/>
-            <w:tcMar>
-              <w:top w:type="dxa" w:w="90"/>
-              <w:left w:type="dxa" w:w="120"/>
-              <w:bottom w:type="dxa" w:w="90"/>
-              <w:right w:type="dxa" w:w="120"/>
-            </w:tcMar>
-          </w:tcPr>
-          <w:p>
-            <w:r>
-              <w:rPr>
-                <w:color w:val="767171"/>
-                <w:sz w:val="19"/>
-                <w:szCs w:val="19"/>
-              </w:rPr>
-              <w:t xml:space="preserve"> </w:t>
-            </w:r>
-          </w:p>
-        </w:tc>
-        <w:tc>
-          <w:tcPr>
-            <w:tcW w:type="dxa" w:w="4360"/>
-            <w:shd w:fill="F2F2F2" w:color="auto" w:val="clear"/>
-            <w:tcMar>
-              <w:top w:type="dxa" w:w="90"/>
-              <w:left w:type="dxa" w:w="120"/>
-              <w:bottom w:type="dxa" w:w="90"/>
-              <w:right w:type="dxa" w:w="120"/>
-            </w:tcMar>
-          </w:tcPr>
-          <w:p>
-            <w:r>
-              <w:rPr>
-                <w:color w:val="767171"/>
-                <w:sz w:val="19"/>
-                <w:szCs w:val="19"/>
-              </w:rPr>
-              <w:t xml:space="preserve"> </w:t>
-            </w:r>
-          </w:p>
-        </w:tc>
-      </w:tr>
-      <w:tr>
-        <w:trPr>
-          <w:cantSplit/>
-        </w:trPr>
-        <w:tc>
-          <w:tcPr>
-            <w:tcW w:type="dxa" w:w="2600"/>
-            <w:tcMar>
-              <w:top w:type="dxa" w:w="90"/>
-              <w:left w:type="dxa" w:w="120"/>
-              <w:bottom w:type="dxa" w:w="90"/>
-              <w:right w:type="dxa" w:w="120"/>
-            </w:tcMar>
-          </w:tcPr>
-          <w:p>
-            <w:r>
-              <w:rPr>
-                <w:color w:val="000000"/>
-                <w:sz w:val="19"/>
-                <w:szCs w:val="19"/>
-              </w:rPr>
-              <w:t xml:space="preserve">Cell size</w:t>
-            </w:r>
-          </w:p>
-        </w:tc>
-        <w:tc>
-          <w:tcPr>
-            <w:tcW w:type="dxa" w:w="2400"/>
-            <w:tcMar>
-              <w:top w:type="dxa" w:w="90"/>
-              <w:left w:type="dxa" w:w="120"/>
-              <w:bottom w:type="dxa" w:w="90"/>
-              <w:right w:type="dxa" w:w="120"/>
-            </w:tcMar>
-          </w:tcPr>
-          <w:p>
-            <w:r>
-              <w:rPr>
-                <w:color w:val="767171"/>
-                <w:sz w:val="19"/>
-                <w:szCs w:val="19"/>
-              </w:rPr>
-              <w:t xml:space="preserve"> </w:t>
-            </w:r>
-          </w:p>
-        </w:tc>
-        <w:tc>
-          <w:tcPr>
-            <w:tcW w:type="dxa" w:w="4360"/>
-            <w:tcMar>
-              <w:top w:type="dxa" w:w="90"/>
-              <w:left w:type="dxa" w:w="120"/>
-              <w:bottom w:type="dxa" w:w="90"/>
-              <w:right w:type="dxa" w:w="120"/>
-            </w:tcMar>
-          </w:tcPr>
-          <w:p>
-            <w:r>
-              <w:rPr>
-                <w:color w:val="767171"/>
-                <w:sz w:val="19"/>
-                <w:szCs w:val="19"/>
-              </w:rPr>
-              <w:t xml:space="preserve"> </w:t>
-            </w:r>
-          </w:p>
-        </w:tc>
-      </w:tr>
-    </w:tbl>
-    <w:p>
-      <w:pPr>
-        <w:pStyle w:val="Caption"/>
-        <w:spacing w:after="240" w:before="100"/>
-      </w:pPr>
-      <w:r>
-        <w:rPr>
-          <w:b/>
-          <w:bCs/>
-          <w:color w:val="1F3864"/>
-          <w:sz w:val="19"/>
-          <w:szCs w:val="19"/>
-        </w:rPr>
-        <w:t xml:space="preserve">Table 1. Metadata for the DEM.</w:t>
-      </w:r>
-    </w:p>
-    <w:p>
-      <w:pPr>
-        <w:pStyle w:val="Heading1"/>
-        <w:spacing w:after="80" w:before="280"/>
-      </w:pPr>
-      <w:r>
-        <w:rPr>
-          <w:b/>
-          <w:bCs/>
-          <w:color w:val="1F3864"/>
-          <w:sz w:val="28"/>
-          <w:szCs w:val="28"/>
-        </w:rPr>
-        <w:t xml:space="preserve">3.  The Model</w:t>
+        <w:t>2.  The Model</w:t>
       </w:r>
     </w:p>
     <w:p>
@@ -2369,7 +2005,7 @@
           <w:sz w:val="28"/>
           <w:szCs w:val="28"/>
         </w:rPr>
-        <w:t xml:space="preserve">4.  Check Values</w:t>
+        <w:t>3.  Check Values</w:t>
       </w:r>
     </w:p>
     <w:p>
@@ -2645,7 +2281,7 @@
           <w:sz w:val="28"/>
           <w:szCs w:val="28"/>
         </w:rPr>
-        <w:t xml:space="preserve">5.  Testing the Assumptions</w:t>
+        <w:t>4.  Testing the Assumptions</w:t>
       </w:r>
     </w:p>
     <w:p>
@@ -2660,7 +2296,7 @@
           <w:sz w:val="19"/>
           <w:szCs w:val="19"/>
         </w:rPr>
-        <w:t>Rubric: one table with the baseline and the two Step 9 runs (250 points; the wide outline), with the points kept, the outline area, the volume and the tallest cell, and the numbers match a run with your seed (5 points). Step 9 says where to read each value.</w:t>
+        <w:t>Rubric: one table with the baseline and the two Step 9 runs (the wide outline; the spline base), with the points kept, the outline area, the volume, the tallest cell and the lowest cell, and the numbers match a run with your seed (5 points). Step 9 says where to read each value.</w:t>
       </w:r>
     </w:p>
     <w:p>
@@ -2696,6 +2332,7 @@
         <w:gridCol w:w="1350"/>
         <w:gridCol w:w="1250"/>
         <w:gridCol w:w="1300"/>
+        <w:gridCol w:w="1300"/>
       </w:tblGrid>
       <w:tr>
         <w:trPr>
@@ -2846,6 +2483,30 @@
             </w:r>
           </w:p>
         </w:tc>
+        <w:tc>
+          <w:tcPr>
+            <w:tcW w:type="dxa" w:w="1300"/>
+            <w:shd w:fill="D9E2F3" w:color="auto" w:val="clear"/>
+            <w:tcMar>
+              <w:top w:type="dxa" w:w="90"/>
+              <w:left w:type="dxa" w:w="120"/>
+              <w:bottom w:type="dxa" w:w="90"/>
+              <w:right w:type="dxa" w:w="120"/>
+            </w:tcMar>
+          </w:tcPr>
+          <w:p>
+            <w:r>
+              <w:rPr>
+                <w:b/>
+                <w:bCs/>
+                <w:color w:val="1F3864"/>
+                <w:sz w:val="19"/>
+                <w:szCs w:val="19"/>
+              </w:rPr>
+              <w:t>Lowest cell (m)</w:t>
+            </w:r>
+          </w:p>
+        </w:tc>
       </w:tr>
       <w:tr>
         <w:trPr>
@@ -2977,6 +2638,27 @@
             </w:r>
           </w:p>
         </w:tc>
+        <w:tc>
+          <w:tcPr>
+            <w:tcW w:type="dxa" w:w="1300"/>
+            <w:tcMar>
+              <w:top w:type="dxa" w:w="90"/>
+              <w:left w:type="dxa" w:w="120"/>
+              <w:bottom w:type="dxa" w:w="90"/>
+              <w:right w:type="dxa" w:w="120"/>
+            </w:tcMar>
+          </w:tcPr>
+          <w:p>
+            <w:r>
+              <w:rPr>
+                <w:color w:val="767171"/>
+                <w:sz w:val="19"/>
+                <w:szCs w:val="19"/>
+              </w:rPr>
+              <w:t xml:space="preserve"> </w:t>
+            </w:r>
+          </w:p>
+        </w:tc>
       </w:tr>
       <w:tr>
         <w:trPr>
@@ -3000,7 +2682,7 @@
                 <w:sz w:val="19"/>
                 <w:szCs w:val="19"/>
               </w:rPr>
-              <w:t xml:space="preserve">250 points</w:t>
+              <w:t>Wide outline (+200 m)</w:t>
             </w:r>
           </w:p>
         </w:tc>
@@ -3073,6 +2755,28 @@
         <w:tc>
           <w:tcPr>
             <w:tcW w:type="dxa" w:w="1250"/>
+            <w:shd w:fill="F2F2F2" w:color="auto" w:val="clear"/>
+            <w:tcMar>
+              <w:top w:type="dxa" w:w="90"/>
+              <w:left w:type="dxa" w:w="120"/>
+              <w:bottom w:type="dxa" w:w="90"/>
+              <w:right w:type="dxa" w:w="120"/>
+            </w:tcMar>
+          </w:tcPr>
+          <w:p>
+            <w:r>
+              <w:rPr>
+                <w:color w:val="767171"/>
+                <w:sz w:val="19"/>
+                <w:szCs w:val="19"/>
+              </w:rPr>
+              <w:t xml:space="preserve"> </w:t>
+            </w:r>
+          </w:p>
+        </w:tc>
+        <w:tc>
+          <w:tcPr>
+            <w:tcW w:type="dxa" w:w="1300"/>
             <w:shd w:fill="F2F2F2" w:color="auto" w:val="clear"/>
             <w:tcMar>
               <w:top w:type="dxa" w:w="90"/>
@@ -3137,7 +2841,7 @@
                 <w:sz w:val="19"/>
                 <w:szCs w:val="19"/>
               </w:rPr>
-              <w:t>Wide outline (+200 m)</w:t>
+              <w:t>Spline base</w:t>
             </w:r>
           </w:p>
         </w:tc>
@@ -3210,6 +2914,28 @@
         <w:tc>
           <w:tcPr>
             <w:tcW w:type="dxa" w:w="1250"/>
+            <w:shd w:fill="F2F2F2" w:color="auto" w:val="clear"/>
+            <w:tcMar>
+              <w:top w:type="dxa" w:w="90"/>
+              <w:left w:type="dxa" w:w="120"/>
+              <w:bottom w:type="dxa" w:w="90"/>
+              <w:right w:type="dxa" w:w="120"/>
+            </w:tcMar>
+          </w:tcPr>
+          <w:p>
+            <w:r>
+              <w:rPr>
+                <w:color w:val="767171"/>
+                <w:sz w:val="19"/>
+                <w:szCs w:val="19"/>
+              </w:rPr>
+              <w:t xml:space="preserve"> </w:t>
+            </w:r>
+          </w:p>
+        </w:tc>
+        <w:tc>
+          <w:tcPr>
+            <w:tcW w:type="dxa" w:w="1300"/>
             <w:shd w:fill="F2F2F2" w:color="auto" w:val="clear"/>
             <w:tcMar>
               <w:top w:type="dxa" w:w="90"/>
@@ -3282,7 +3008,7 @@
           <w:sz w:val="22"/>
           <w:szCs w:val="22"/>
         </w:rPr>
-        <w:t>Which choice moved the volume more, the points or the outline? Give each run's difference from the baseline in cubic kilometers and as a percentage. (3 points)</w:t>
+        <w:t>Which choice moved the volume more, the outline or the method? Give each run's difference from the baseline in cubic kilometers and as a percentage. (2 points)</w:t>
       </w:r>
     </w:p>
     <w:p>
@@ -3312,7 +3038,7 @@
           <w:sz w:val="22"/>
           <w:szCs w:val="22"/>
         </w:rPr>
-        <w:t>What did the wider outline change: the area it counts, the plain it rebuilt, or both? Argue from your table's columns. (2 points)</w:t>
+        <w:t>What did the spline do that IDW cannot? Your lowest-cell column and Map 2 show it; explain it with what you learned about the two methods in Week 9 and Lab 8, and say which base you would trust for the volume, and why. (3 points here, 2 in the write-up)</w:t>
       </w:r>
     </w:p>
     <w:p>
@@ -3342,7 +3068,7 @@
           <w:sz w:val="28"/>
           <w:szCs w:val="28"/>
         </w:rPr>
-        <w:t xml:space="preserve">6.  What the Volume Measures</w:t>
+        <w:t>5.  What the Volume Measures</w:t>
       </w:r>
     </w:p>
     <w:p>
@@ -3357,7 +3083,7 @@
           <w:sz w:val="19"/>
           <w:szCs w:val="19"/>
         </w:rPr>
-        <w:t>Rubric: what the volume measures and what the model cannot see (2 points). Step 9, question 2: is it the volume of the lava dome? Say what part of the dome the model cannot see, and what data would let you measure it.</w:t>
+        <w:t>Rubric: what the volume measures and what the model cannot see (2 points). Step 9, question 3: is it the volume of the lava dome? Say what part of the dome the model cannot see, and what data would let you measure it.</w:t>
       </w:r>
     </w:p>
     <w:p>
@@ -3392,7 +3118,7 @@
           <w:sz w:val="28"/>
           <w:szCs w:val="28"/>
         </w:rPr>
-        <w:t xml:space="preserve">7.  Maps</w:t>
+        <w:t>6.  Maps</w:t>
       </w:r>
     </w:p>
     <w:p>
@@ -3503,7 +3229,7 @@
           <w:sz w:val="19"/>
           <w:szCs w:val="19"/>
         </w:rPr>
-        <w:t xml:space="preserve">Everything Map 1 needs except the inset, with the same color scale, plus: the title and text box say what changed from Map 1 and by how much.</w:t>
+        <w:t>Everything Map 1 needs except the inset, in the same color scale as Map 1 plus one class of its own for cells below zero, where the spline plain rose above the ground. The title and text box say which method made the base, the volume, and how far it is from Map 1's.</w:t>
       </w:r>
     </w:p>
     <w:tbl>
@@ -3564,7 +3290,7 @@
           <w:sz w:val="19"/>
           <w:szCs w:val="19"/>
         </w:rPr>
-        <w:t>Map 2. The wide-outline run from Step 9, same color scale as Map 1.</w:t>
+        <w:t>Map 2. The spline base from Step 9, same color scale as Map 1.</w:t>
       </w:r>
     </w:p>
     <w:p>
@@ -3585,7 +3311,7 @@
           <w:sz w:val="28"/>
           <w:szCs w:val="28"/>
         </w:rPr>
-        <w:t xml:space="preserve">8.  References</w:t>
+        <w:t>7.  References</w:t>
       </w:r>
     </w:p>
     <w:p>
@@ -3630,7 +3356,7 @@
           <w:sz w:val="28"/>
           <w:szCs w:val="28"/>
         </w:rPr>
-        <w:t xml:space="preserve">9.  AI Use Statement</w:t>
+        <w:t>8.  AI Use Statement</w:t>
       </w:r>
     </w:p>
     <w:p>
@@ -3680,7 +3406,7 @@
           <w:sz w:val="28"/>
           <w:szCs w:val="28"/>
         </w:rPr>
-        <w:t xml:space="preserve">10.  Self-Graded Rubric</w:t>
+        <w:t>9.  Self-Graded Rubric</w:t>
       </w:r>
     </w:p>
     <w:p>
@@ -3869,7 +3595,7 @@
                 <w:sz w:val="17"/>
                 <w:szCs w:val="17"/>
               </w:rPr>
-              <w:t xml:space="preserve">The three metadata values for the DEM and what each means for your result (2)</w:t>
+              <w:t xml:space="preserve">Your check values from Steps 4 to 8 (2)</w:t>
             </w:r>
           </w:p>
           <w:p>
@@ -3886,7 +3612,7 @@
                 <w:sz w:val="17"/>
                 <w:szCs w:val="17"/>
               </w:rPr>
-              <w:t xml:space="preserve">Your check values from Steps 4 to 8 (2)</w:t>
+              <w:t>What the volume measures and what the model cannot see (Step 9, question 3) (2)</w:t>
             </w:r>
           </w:p>
           <w:p>
@@ -3903,7 +3629,7 @@
                 <w:sz w:val="17"/>
                 <w:szCs w:val="17"/>
               </w:rPr>
-              <w:t>What the volume measures and what the model cannot see (Step 9, question 2) (2)</w:t>
+              <w:t>Which base you would trust for the volume, IDW or spline, and why (Step 9, question 2) (2)</w:t>
             </w:r>
           </w:p>
           <w:p>
@@ -4350,7 +4076,7 @@
                 <w:sz w:val="19"/>
                 <w:szCs w:val="19"/>
               </w:rPr>
-              <w:t>Map 2 — the wide outline (full page, 8.5 × 11)</w:t>
+              <w:t>Map 2 — the spline base (full page, 8.5 × 11)</w:t>
             </w:r>
           </w:p>
           <w:p>
@@ -4367,7 +4093,7 @@
                 <w:sz w:val="17"/>
                 <w:szCs w:val="17"/>
               </w:rPr>
-              <w:t xml:space="preserve">Title, with the volume in it or in a text box (1)</w:t>
+              <w:t>Title, with the method and the volume in it or in a text box (1)</w:t>
             </w:r>
           </w:p>
           <w:p>
@@ -4384,7 +4110,7 @@
                 <w:sz w:val="17"/>
                 <w:szCs w:val="17"/>
               </w:rPr>
-              <w:t xml:space="preserve">Neat line, north arrow and scale bar (1)</w:t>
+              <w:t>Neat line, north arrow and scale bar (1)</w:t>
             </w:r>
           </w:p>
           <w:p>
@@ -4401,7 +4127,7 @@
                 <w:sz w:val="17"/>
                 <w:szCs w:val="17"/>
               </w:rPr>
-              <w:t xml:space="preserve">Text box with author, date, map projection, and the DEM's source and date (1)</w:t>
+              <w:t>Text box with author, date, map projection, and the DEM's source and date (1)</w:t>
             </w:r>
           </w:p>
           <w:p>
@@ -4418,7 +4144,7 @@
                 <w:sz w:val="17"/>
                 <w:szCs w:val="17"/>
               </w:rPr>
-              <w:t xml:space="preserve">Height above the plain in the same color scale as Map 1, with a legend (2)</w:t>
+              <w:t>Height above the plain in the same color scale as Map 1, with a legend, plus one class for cells below zero (3)</w:t>
             </w:r>
           </w:p>
           <w:p>
@@ -4435,7 +4161,7 @@
                 <w:sz w:val="17"/>
                 <w:szCs w:val="17"/>
               </w:rPr>
-              <w:t xml:space="preserve">The outline used, over a hillshade or imagery (1)</w:t>
+              <w:t>The outline over a hillshade or imagery (1)</w:t>
             </w:r>
           </w:p>
           <w:p>
@@ -4452,7 +4178,7 @@
                 <w:sz w:val="17"/>
                 <w:szCs w:val="17"/>
               </w:rPr>
-              <w:t xml:space="preserve">Title and text box say what changed from Map 1 and by how much (2)</w:t>
+              <w:t>Text box says how far the volume is from Map 1's (1)</w:t>
             </w:r>
           </w:p>
           <w:p>
@@ -4469,7 +4195,7 @@
                 <w:sz w:val="17"/>
                 <w:szCs w:val="17"/>
               </w:rPr>
-              <w:t xml:space="preserve">Scale and legibility appropriate to the butte (2)</w:t>
+              <w:t>Scale and legibility appropriate to the butte (2)</w:t>
             </w:r>
           </w:p>
         </w:tc>
@@ -4567,7 +4293,7 @@
                 <w:sz w:val="17"/>
                 <w:szCs w:val="17"/>
               </w:rPr>
-              <w:t>One table with the baseline and the two Step 9 runs (250 points; the wide outline), with the points kept, the outline area, the volume and the tallest cell, and the numbers match a run with your seed (5)</w:t>
+              <w:t>One table with the baseline and the two Step 9 runs (the wide outline; the spline base), with the points kept, the outline area, the volume, the tallest cell and the lowest cell, and the numbers match a run with your seed (5)</w:t>
             </w:r>
           </w:p>
           <w:p>
@@ -4584,7 +4310,7 @@
                 <w:sz w:val="17"/>
                 <w:szCs w:val="17"/>
               </w:rPr>
-              <w:t>Which choice moved the volume more, with each run's difference from the baseline in cubic kilometers and as a percentage (3)</w:t>
+              <w:t>Which choice moved the volume more, with each run's difference from the baseline in cubic kilometers and as a percentage (2)</w:t>
             </w:r>
           </w:p>
           <w:p>
@@ -4601,7 +4327,7 @@
                 <w:sz w:val="17"/>
                 <w:szCs w:val="17"/>
               </w:rPr>
-              <w:t>What the wider outline changed, the area counted or the plain rebuilt or both, argued from your table (2)</w:t>
+              <w:t>What the spline did that IDW cannot, explained from the lowest-cell column and Map 2 (3)</w:t>
             </w:r>
           </w:p>
         </w:tc>

</xml_diff>

<commit_message>
Lab 9: the Step 9 widening is personal, 3 x the BYU ID digits
The wide-outline run now widens the supplied outline by 3 x (last two
digits of the BYU ID) meters, 0 to 297 m, so each student has a volume
of their own that the grader can check against a run at their distance.
Spline run and Map 2 unchanged. Template gets a digits-and-distance line;
rubric and the "what the grader verifies" note follow Lab 7's pattern.
tools/lab09/personal_oracle.py builds the private lookup for all 100
endings.

Co-Authored-By: Claude Fable 5.1 <noreply@anthropic.com>
</commit_message>
<xml_diff>
--- a/docs/assignments/lab-09/lab09-report-template.docx
+++ b/docs/assignments/lab-09/lab09-report-template.docx
@@ -2296,7 +2296,22 @@
           <w:sz w:val="19"/>
           <w:szCs w:val="19"/>
         </w:rPr>
-        <w:t>Rubric: one table with the baseline and the two Step 9 runs (the wide outline; the spline base), with the points kept, the outline area, the volume, the tallest cell and the lowest cell, and the numbers match a run with your seed (5 points). Step 9 says where to read each value.</w:t>
+        <w:t>Rubric: one table with the baseline and the two Step 9 runs (your wide outline; the spline base), with the points kept, the outline area, the volume, the tallest cell and the lowest cell; your digits and distance stated, and the numbers match a run at your distance (5 points). Step 9 says where to read each value.</w:t>
+      </w:r>
+    </w:p>
+    <w:p>
+      <w:pPr>
+        <w:spacing w:after="160" w:before="60"/>
+      </w:pPr>
+      <w:r>
+        <w:rPr>
+          <w:i/>
+          <w:iCs/>
+          <w:color w:val="767171"/>
+          <w:sz w:val="19"/>
+          <w:szCs w:val="19"/>
+        </w:rPr>
+        <w:t>Last two digits of my BYU ID: [dd].  Outline widened by 3 × [dd] = [___] m.</w:t>
       </w:r>
     </w:p>
     <w:p>
@@ -2682,7 +2697,7 @@
                 <w:sz w:val="19"/>
                 <w:szCs w:val="19"/>
               </w:rPr>
-              <w:t>Wide outline (+200 m)</w:t>
+              <w:t>Wide outline (+[___] m, mine)</w:t>
             </w:r>
           </w:p>
         </w:tc>
@@ -4293,7 +4308,7 @@
                 <w:sz w:val="17"/>
                 <w:szCs w:val="17"/>
               </w:rPr>
-              <w:t>One table with the baseline and the two Step 9 runs (the wide outline; the spline base), with the points kept, the outline area, the volume, the tallest cell and the lowest cell, and the numbers match a run with your seed (5)</w:t>
+              <w:t>One table with the baseline and the two Step 9 runs (your wide outline; the spline base), with the points kept, the outline area, the volume, the tallest cell and the lowest cell; your digits and distance stated, and the numbers match a run at your distance (5)</w:t>
             </w:r>
           </w:p>
           <w:p>

</xml_diff>